<commit_message>
fix & docs: completamento task 7 con debugging, refactoring del codice, gestione warning e stesura del README
</commit_message>
<xml_diff>
--- a/ESERCITAZIONI FINALI/M4_ESERCITAZIONEFINALE_GOIZA/README.docx
+++ b/ESERCITAZIONI FINALI/M4_ESERCITAZIONEFINALE_GOIZA/README.docx
@@ -605,8 +605,10 @@
       <w:r>
         <w:t xml:space="preserve"> e nomi espliciti.</w:t>
       </w:r>
+      <w:r>
+        <w:t xml:space="preserve"> </w:t>
+      </w:r>
     </w:p>
-    <w:p/>
     <w:sectPr>
       <w:pgSz w:w="11906" w:h="16838"/>
       <w:pgMar w:top="1440" w:right="1440" w:bottom="1440" w:left="1440" w:header="708" w:footer="708" w:gutter="0"/>
@@ -1345,6 +1347,7 @@
   <w:style w:type="character" w:default="1" w:styleId="Carpredefinitoparagrafo">
     <w:name w:val="Default Paragraph Font"/>
     <w:uiPriority w:val="1"/>
+    <w:semiHidden/>
     <w:unhideWhenUsed/>
   </w:style>
   <w:style w:type="table" w:default="1" w:styleId="Tabellanormale">

</xml_diff>